<commit_message>
docs(oss): NOTICE 署名改 maning636 + 发布口径文档 + D1-D5 追认确认表
执行《开源发布收尾 · 待决表》的 P2=A 与 P4=A。

P2=A：NOTICE.txt 第 3 行版权署名从占位「老马AI工作台（Prism-Fusion）贡献者」
      改成 maning636（与 GitHub 账号一致，可追溯到人）。

P4=A：D1-D5 全部按实际落地追认（D1=A　D2=A　D3=B　D4=A　D5=A）。
- 新建 docs/release-delivery-statement.md：对外交付口径的唯一权威出处
  （下载地址 / 字节数 / SHA-512 / D1-D5 确认结果 / 商业与解锁口径 / 本版不做的事）
- docs/client-release-decision-form.docx 重建为**确认态**：选项框按结果打勾，
  每项写明实际落地事实；builder 加 --blank 可重建当初的空白表
- docs/PROJECT_OVERVIEW.md：§8 补「对外发布（v1.1.5）」行，§9 挂对外口径文档索引
- docs/client-acceptance-checklist.docx：同步「D1-D5 已追认」的措辞

工具链修复（往返测试红项的真实原因）：
- scripts/docs/_decision_form_common.py：parse_sections 的 end_heading 支持多个标题；
  verify() 早前已修成 fldSimple / 复杂域都认（Word、WPS 重存后不再误报）
- read_client_release_decision_form.py：兼容两种结尾标题
- 两个往返测试改为从 builder 的**空白表**出发：拿已填的表当底会「勾出两个框」，
  测的就不是「填了能读」而是「填了会打架」
- build_release_finalize_decision_form.py：加 --out，避免测试重跑覆盖已填的表
</commit_message>
<xml_diff>
--- a/docs/client-release-decision-form.docx
+++ b/docs/client-release-decision-form.docx
@@ -52,7 +52,7 @@
           <w:color w:val="2E5395"/>
           <w:sz w:val="24"/>
         </w:rPr>
-        <w:t>单一客户端已落地，5 处岔路口等你拍板</w:t>
+        <w:t>D1–D5 已全部确认并落地（这张表不用再填了）</w:t>
       </w:r>
     </w:p>
     <w:p>
@@ -68,7 +68,7 @@
           <w:color w:val="595959"/>
           <w:sz w:val="20"/>
         </w:rPr>
-        <w:t>版本 v1.0　|　日期 2026-10-24　|　对应代码 e6c1925</w:t>
+        <w:t>版本 v1.1（已确认）　|　日期 2026-10-24　|　对应交付 v1.1.5</w:t>
       </w:r>
     </w:p>
     <w:p>
@@ -145,7 +145,7 @@
                 <w:i w:val="0"/>
                 <w:sz w:val="20"/>
               </w:rPr>
-              <w:t>单一客户端已经打出来了（1.1.4），但发布前有 5 处必须你定：安装包叫什么、license 怎么写、源码怎么给、用户拿什么解锁、610 MB 能不能接受。</w:t>
+              <w:t>单一客户端（1.1.5）已经打出来并发布，这张表记录发布形态 5 处岔路口的最终口径。</w:t>
             </w:r>
           </w:p>
         </w:tc>
@@ -169,7 +169,7 @@
                 <w:color w:val="1F3864"/>
                 <w:sz w:val="20"/>
               </w:rPr>
-              <w:t>一共几处要你拍板</w:t>
+              <w:t>确认结果</w:t>
             </w:r>
           </w:p>
         </w:tc>
@@ -189,7 +189,7 @@
                 <w:i w:val="0"/>
                 <w:sz w:val="20"/>
               </w:rPr>
-              <w:t>5 项（D1–D5）。每一项我都写了「我已核实的事实」「选项」「我的建议」，你只需要勾。</w:t>
+              <w:t>D1=A　D2=A　D3=B　D4=A　D5=A —— 五项全部按实际落地追认，选项框已按结果打勾。</w:t>
             </w:r>
           </w:p>
         </w:tc>
@@ -213,7 +213,7 @@
                 <w:color w:val="1F3864"/>
                 <w:sz w:val="20"/>
               </w:rPr>
-              <w:t>填完怎么给我</w:t>
+              <w:t>确认依据</w:t>
             </w:r>
           </w:p>
         </w:tc>
@@ -233,7 +233,7 @@
                 <w:i w:val="0"/>
                 <w:sz w:val="20"/>
               </w:rPr>
-              <w:t>① 把这个 .docx 存回发给我；② 或者直接念勾选结果（「D1 选 A、D2 选 A、D3 选 A、D4 选 A、D5 选 A」）。两种都行。</w:t>
+              <w:t>2026-10-23《开源发布收尾 · 待决表》P4=A：代码早已按选项落地并对公网生效，这张表当时只差一句追认。</w:t>
             </w:r>
           </w:p>
         </w:tc>
@@ -257,7 +257,7 @@
                 <w:color w:val="1F3864"/>
                 <w:sz w:val="20"/>
               </w:rPr>
-              <w:t>填不完怎么办</w:t>
+              <w:t>和当初建议的差异</w:t>
             </w:r>
           </w:p>
         </w:tc>
@@ -277,7 +277,7 @@
                 <w:i w:val="0"/>
                 <w:sz w:val="20"/>
               </w:rPr>
-              <w:t>不想逐项勾，就在最下面的「总快速批注」区写一句总规则，例如「五项都按建议来」。</w:t>
+              <w:t>只有 D3 不同：当初建议 A（官网下载区放源码包），实际落地选了 B（公开 GitHub 仓），按实际落地追认。</w:t>
             </w:r>
           </w:p>
         </w:tc>
@@ -301,7 +301,7 @@
                 <w:color w:val="1F3864"/>
                 <w:sz w:val="20"/>
               </w:rPr>
-              <w:t>会影响已经做完的事吗</w:t>
+              <w:t>还要你做什么吗</w:t>
             </w:r>
           </w:p>
         </w:tc>
@@ -321,7 +321,7 @@
                 <w:i w:val="0"/>
                 <w:sz w:val="20"/>
               </w:rPr>
-              <w:t>D1 会改安装包文件名（要重打）；D2/D3 要动官网与源码包；D4/D5 动的是下一版的规划，不影响这一版上线。</w:t>
+              <w:t>不需要。已落地的部分不再改代码；要改的是下一版（安装包瘦身 / 云端账号体系）。</w:t>
             </w:r>
           </w:p>
         </w:tc>
@@ -344,7 +344,7 @@
           <w:color w:val="1F3864"/>
           <w:sz w:val="32"/>
         </w:rPr>
-        <w:t>0　怎么填这份表</w:t>
+        <w:t>0　确认记录（这张表不用再填）</w:t>
       </w:r>
     </w:p>
     <w:tbl>
@@ -384,7 +384,7 @@
                 <w:color w:val="1F3864"/>
                 <w:sz w:val="20"/>
               </w:rPr>
-              <w:t>选项行</w:t>
+              <w:t>这份表现在的状态</w:t>
             </w:r>
           </w:p>
         </w:tc>
@@ -404,7 +404,7 @@
                 <w:i w:val="0"/>
                 <w:sz w:val="20"/>
               </w:rPr>
-              <w:t>一行几个候选，前面带 □ 框。在框里打「√」，或者把 □ 改成 ☑（Word 里输入 2611 字符），也可以直接在框后写「选 A」。</w:t>
+              <w:t>已确认。五个选项框已按确认结果打勾，每项下面写明实际落地的事实（可当场核对的字节数 / 链接 / 配置值）。</w:t>
             </w:r>
           </w:p>
         </w:tc>
@@ -428,7 +428,7 @@
                 <w:color w:val="1F3864"/>
                 <w:sz w:val="20"/>
               </w:rPr>
-              <w:t>「我的选择」行</w:t>
+              <w:t>还能改吗</w:t>
             </w:r>
           </w:p>
         </w:tc>
@@ -448,7 +448,7 @@
                 <w:i w:val="0"/>
                 <w:sz w:val="20"/>
               </w:rPr>
-              <w:t>每个小节最后那行「→ 我的选择：____」，直接写 A/B/C 或一句话。</w:t>
+              <w:t>能，但要走流程：先改对应代码与对外文案，再同步更新本表，并在当轮提交里写明改了什么。</w:t>
             </w:r>
           </w:p>
         </w:tc>
@@ -472,7 +472,7 @@
                 <w:color w:val="1F3864"/>
                 <w:sz w:val="20"/>
               </w:rPr>
-              <w:t>快速批注</w:t>
+              <w:t>空白版怎么要回来</w:t>
             </w:r>
           </w:p>
         </w:tc>
@@ -492,7 +492,7 @@
                 <w:i w:val="0"/>
                 <w:sz w:val="20"/>
               </w:rPr>
-              <w:t>小节下面的横线区，或文末的总批注区。写一句总规则就够，我按它兜底。</w:t>
+              <w:t>builder 支持 --blank：重跑 scripts/docs/build_client_release_decision_form.py --blank 可重建当初的空白待决表（往返测试用的就是它）。</w:t>
             </w:r>
           </w:p>
         </w:tc>
@@ -525,7 +525,7 @@
           <w:color w:val="595959"/>
           <w:sz w:val="20"/>
         </w:rPr>
-        <w:t>「当前建议」是我基于已核实事实给的推荐，不是结论；「我的选择」列留空给你填。</w:t>
+        <w:t>「当前建议」是当初我给的推荐；「我的选择」列是 2026-10-23 追认的结果（D1=A　D2=A　D3=B　D4=A　D5=A），五项各恰好一个。</w:t>
       </w:r>
     </w:p>
     <w:tbl>
@@ -721,10 +721,11 @@
             <w:r>
               <w:rPr>
                 <w:rFonts w:ascii="等线" w:hAnsi="等线" w:eastAsia="等线"/>
-                <w:b w:val="0"/>
+                <w:b/>
                 <w:i w:val="0"/>
                 <w:sz w:val="18"/>
               </w:rPr>
+              <w:t>A ✅ 已落地</w:t>
             </w:r>
           </w:p>
         </w:tc>
@@ -807,10 +808,11 @@
             <w:r>
               <w:rPr>
                 <w:rFonts w:ascii="等线" w:hAnsi="等线" w:eastAsia="等线"/>
-                <w:b w:val="0"/>
+                <w:b/>
                 <w:i w:val="0"/>
                 <w:sz w:val="18"/>
               </w:rPr>
+              <w:t>A ✅ 已落地</w:t>
             </w:r>
           </w:p>
         </w:tc>
@@ -893,10 +895,11 @@
             <w:r>
               <w:rPr>
                 <w:rFonts w:ascii="等线" w:hAnsi="等线" w:eastAsia="等线"/>
-                <w:b w:val="0"/>
+                <w:b/>
                 <w:i w:val="0"/>
                 <w:sz w:val="18"/>
               </w:rPr>
+              <w:t>B ✅ 已落地</w:t>
             </w:r>
           </w:p>
         </w:tc>
@@ -979,10 +982,11 @@
             <w:r>
               <w:rPr>
                 <w:rFonts w:ascii="等线" w:hAnsi="等线" w:eastAsia="等线"/>
-                <w:b w:val="0"/>
+                <w:b/>
                 <w:i w:val="0"/>
                 <w:sz w:val="18"/>
               </w:rPr>
+              <w:t>A ✅ 已落地</w:t>
             </w:r>
           </w:p>
         </w:tc>
@@ -1065,10 +1069,11 @@
             <w:r>
               <w:rPr>
                 <w:rFonts w:ascii="等线" w:hAnsi="等线" w:eastAsia="等线"/>
-                <w:b w:val="0"/>
+                <w:b/>
                 <w:i w:val="0"/>
                 <w:sz w:val="18"/>
               </w:rPr>
+              <w:t>A ✅ 已落地</w:t>
             </w:r>
           </w:p>
         </w:tc>
@@ -1091,7 +1096,7 @@
           <w:color w:val="2E5395"/>
           <w:sz w:val="19"/>
         </w:rPr>
-        <w:t>⚠️ D1 会改安装包文件名（要重打一次）；D2 / D3 要动官网与源码包，其余两项影响的是下一版规划，不卡这一版上线。</w:t>
+        <w:t>✅ D1–D5 五项已按实际落地追认并写回本表；D3 采用公开 GitHub 仓（比当初建议的官网源码包更彻底），官网下载区已有源码入口。</w:t>
       </w:r>
     </w:p>
     <w:p>
@@ -1146,6 +1151,22 @@
     </w:p>
     <w:p>
       <w:pPr>
+        <w:spacing w:before="0" w:after="80" w:lineRule="auto" w:line="336"/>
+        <w:ind w:left="227"/>
+      </w:pPr>
+      <w:r>
+        <w:rPr>
+          <w:rFonts w:ascii="等线" w:hAnsi="等线" w:eastAsia="等线"/>
+          <w:b w:val="0"/>
+          <w:i w:val="0"/>
+          <w:color w:val="2E5395"/>
+          <w:sz w:val="19"/>
+        </w:rPr>
+        <w:t>✅ 确认落地：已落地：desktop-electron/package.json 的 build.artifactName = LaomaAI-${version}-setup.${ext}；1.1.5 实际产物 LaomaAI-1.1.5-setup.exe（639,437,816 B，纯 ASCII，官网按钮、Release 资产、latest.yml 三处同名）。</w:t>
+      </w:r>
+    </w:p>
+    <w:p>
+      <w:pPr>
         <w:spacing w:before="0" w:after="60" w:lineRule="auto" w:line="336"/>
         <w:ind w:left="227"/>
       </w:pPr>
@@ -1156,7 +1177,7 @@
           <w:i w:val="0"/>
           <w:sz w:val="20"/>
         </w:rPr>
-        <w:t>□ A. LaomaAI-1.1.4-setup.exe —— 纯 ASCII（当前正在打的这个）</w:t>
+        <w:t>☑ A. LaomaAI-1.1.4-setup.exe —— 纯 ASCII（当前正在打的这个）</w:t>
       </w:r>
     </w:p>
     <w:p>
@@ -1216,7 +1237,7 @@
           <w:i w:val="0"/>
           <w:sz w:val="20"/>
         </w:rPr>
-        <w:t>→ 我的选择：_______________________________________________</w:t>
+        <w:t>→ 我的选择：A　（已按此落地）_______________________</w:t>
       </w:r>
     </w:p>
     <w:p>
@@ -1282,6 +1303,22 @@
     </w:p>
     <w:p>
       <w:pPr>
+        <w:spacing w:before="0" w:after="80" w:lineRule="auto" w:line="336"/>
+        <w:ind w:left="227"/>
+      </w:pPr>
+      <w:r>
+        <w:rPr>
+          <w:rFonts w:ascii="等线" w:hAnsi="等线" w:eastAsia="等线"/>
+          <w:b w:val="0"/>
+          <w:i w:val="0"/>
+          <w:color w:val="2E5395"/>
+          <w:sz w:val="19"/>
+        </w:rPr>
+        <w:t>✅ 确认落地：已落地：客户端 license 字段 AGPL-3.0，LICENSE.txt 为 AGPL 全文，NOTICE.txt 版权署名 maning636；Hermes（Nous Research，MIT）随包分发并在 NOTICE.txt 归属。</w:t>
+      </w:r>
+    </w:p>
+    <w:p>
+      <w:pPr>
         <w:spacing w:before="0" w:after="60" w:lineRule="auto" w:line="336"/>
         <w:ind w:left="227"/>
       </w:pPr>
@@ -1292,7 +1329,7 @@
           <w:i w:val="0"/>
           <w:sz w:val="20"/>
         </w:rPr>
-        <w:t>□ A. 整个客户端标 AGPL-3.0，官网同时提供含 Hermes 的完整源码包</w:t>
+        <w:t>☑ A. 整个客户端标 AGPL-3.0，官网同时提供含 Hermes 的完整源码包</w:t>
       </w:r>
     </w:p>
     <w:p>
@@ -1352,7 +1389,7 @@
           <w:i w:val="0"/>
           <w:sz w:val="20"/>
         </w:rPr>
-        <w:t>→ 我的选择：_______________________________________________</w:t>
+        <w:t>→ 我的选择：A　（已按此落地）_______________________</w:t>
       </w:r>
     </w:p>
     <w:p>
@@ -1418,6 +1455,22 @@
     </w:p>
     <w:p>
       <w:pPr>
+        <w:spacing w:before="0" w:after="80" w:lineRule="auto" w:line="336"/>
+        <w:ind w:left="227"/>
+      </w:pPr>
+      <w:r>
+        <w:rPr>
+          <w:rFonts w:ascii="等线" w:hAnsi="等线" w:eastAsia="等线"/>
+          <w:b w:val="0"/>
+          <w:i w:val="0"/>
+          <w:color w:val="2E5395"/>
+          <w:sz w:val="19"/>
+        </w:rPr>
+        <w:t>✅ 确认落地：已落地（按 B，比当初建议的 A 更彻底）：源码走公开 GitHub 仓库 github.com/maning636/laoma-ai-workbench，官网下载区已有源码与 Releases 入口，AGPL 的「提供对应源码」义务由公开仓履行。</w:t>
+      </w:r>
+    </w:p>
+    <w:p>
+      <w:pPr>
         <w:spacing w:before="0" w:after="60" w:lineRule="auto" w:line="336"/>
         <w:ind w:left="227"/>
       </w:pPr>
@@ -1443,7 +1496,7 @@
           <w:i w:val="0"/>
           <w:sz w:val="20"/>
         </w:rPr>
-        <w:t>□ B. 独立公开 GitHub 仓库 + 官网链接（更新方便，但公开后不可撤回，且要维护两个仓）</w:t>
+        <w:t>☑ B. 独立公开 GitHub 仓库 + 官网链接（更新方便，但公开后不可撤回，且要维护两个仓）</w:t>
       </w:r>
     </w:p>
     <w:p>
@@ -1488,7 +1541,7 @@
           <w:i w:val="0"/>
           <w:sz w:val="20"/>
         </w:rPr>
-        <w:t>→ 我的选择：_______________________________________________</w:t>
+        <w:t>→ 我的选择：B　（已按此落地）_______________________</w:t>
       </w:r>
     </w:p>
     <w:p>
@@ -1554,6 +1607,22 @@
     </w:p>
     <w:p>
       <w:pPr>
+        <w:spacing w:before="0" w:after="80" w:lineRule="auto" w:line="336"/>
+        <w:ind w:left="227"/>
+      </w:pPr>
+      <w:r>
+        <w:rPr>
+          <w:rFonts w:ascii="等线" w:hAnsi="等线" w:eastAsia="等线"/>
+          <w:b w:val="0"/>
+          <w:i w:val="0"/>
+          <w:color w:val="2E5395"/>
+          <w:sz w:val="19"/>
+        </w:rPr>
+        <w:t>✅ 确认落地：已落地：本地注册码（Ed25519 验签）决定功能档位，云端订阅只给额度（账号数 / 平台数 / Agent 配额）；两者取交集派生「完整版 / 限制功能版」。</w:t>
+      </w:r>
+    </w:p>
+    <w:p>
+      <w:pPr>
         <w:spacing w:before="0" w:after="60" w:lineRule="auto" w:line="336"/>
         <w:ind w:left="227"/>
       </w:pPr>
@@ -1564,7 +1633,7 @@
           <w:i w:val="0"/>
           <w:sz w:val="20"/>
         </w:rPr>
-        <w:t>□ A. 只认注册码（本地验签，离线可用）—— 当前已实现；云端只管 AI 额度不管档位</w:t>
+        <w:t>☑ A. 只认注册码（本地验签，离线可用）—— 当前已实现；云端只管 AI 额度不管档位</w:t>
       </w:r>
     </w:p>
     <w:p>
@@ -1624,7 +1693,7 @@
           <w:i w:val="0"/>
           <w:sz w:val="20"/>
         </w:rPr>
-        <w:t>→ 我的选择：_______________________________________________</w:t>
+        <w:t>→ 我的选择：A　（已按此落地）_______________________</w:t>
       </w:r>
     </w:p>
     <w:p>
@@ -1690,6 +1759,22 @@
     </w:p>
     <w:p>
       <w:pPr>
+        <w:spacing w:before="0" w:after="80" w:lineRule="auto" w:line="336"/>
+        <w:ind w:left="227"/>
+      </w:pPr>
+      <w:r>
+        <w:rPr>
+          <w:rFonts w:ascii="等线" w:hAnsi="等线" w:eastAsia="等线"/>
+          <w:b w:val="0"/>
+          <w:i w:val="0"/>
+          <w:color w:val="2E5395"/>
+          <w:sz w:val="19"/>
+        </w:rPr>
+        <w:t>✅ 确认落地：已落地：单包 639,437,816 B（约 610 MiB），官网按 640 MB 量级提示并给出 SHA-512 校验值。</w:t>
+      </w:r>
+    </w:p>
+    <w:p>
+      <w:pPr>
         <w:spacing w:before="0" w:after="60" w:lineRule="auto" w:line="336"/>
         <w:ind w:left="227"/>
       </w:pPr>
@@ -1700,7 +1785,7 @@
           <w:i w:val="0"/>
           <w:sz w:val="20"/>
         </w:rPr>
-        <w:t>□ A. 接受 ~610 MB 单包：一个下载入口、一个安装器、装完就能用</w:t>
+        <w:t>☑ A. 接受 ~610 MB 单包：一个下载入口、一个安装器、装完就能用</w:t>
       </w:r>
     </w:p>
     <w:p>
@@ -1760,7 +1845,7 @@
           <w:i w:val="0"/>
           <w:sz w:val="20"/>
         </w:rPr>
-        <w:t>→ 我的选择：_______________________________________________</w:t>
+        <w:t>→ 我的选择：A　（已按此落地）_______________________</w:t>
       </w:r>
     </w:p>
     <w:p>
@@ -1811,7 +1896,7 @@
           <w:color w:val="1F3864"/>
           <w:sz w:val="32"/>
         </w:rPr>
-        <w:t>3　总快速批注</w:t>
+        <w:t>3　总快速批注（已确认）</w:t>
       </w:r>
     </w:p>
     <w:p>
@@ -1826,32 +1911,53 @@
           <w:color w:val="595959"/>
           <w:sz w:val="20"/>
         </w:rPr>
-        <w:t>任何一项不想细勾，就在这里写一句总规则，我按它兜底（并会在回执里标明哪些是兜底的）。</w:t>
+        <w:t>原为「不想逐项勾就写一句总规则」的兜底区；现已追认确认，记录如下：</w:t>
       </w:r>
     </w:p>
     <w:p>
       <w:pPr>
-        <w:spacing w:before="0" w:after="120" w:lineRule="auto" w:line="336"/>
-        <w:pBdr>
-          <w:bottom w:val="single" w:sz="6" w:space="1" w:color="C9C9C9"/>
-        </w:pBdr>
+        <w:spacing w:before="0" w:after="80" w:lineRule="auto" w:line="336"/>
+        <w:ind w:left="170"/>
       </w:pPr>
+      <w:r>
+        <w:rPr>
+          <w:rFonts w:ascii="等线" w:hAnsi="等线" w:eastAsia="等线"/>
+          <w:b w:val="0"/>
+          <w:i w:val="0"/>
+          <w:sz w:val="20"/>
+        </w:rPr>
+        <w:t>2026-10-23 马哥在《开源发布收尾 · 待决表》P4 选 A —— 「全部按实际落地确认（D1=A　D2=A　D3=B　D4=A　D5=A）」。代码早已按选项落地并对公网生效，这张表当时只差一句追认。</w:t>
+      </w:r>
     </w:p>
     <w:p>
       <w:pPr>
-        <w:spacing w:before="0" w:after="120" w:lineRule="auto" w:line="336"/>
-        <w:pBdr>
-          <w:bottom w:val="single" w:sz="6" w:space="1" w:color="C9C9C9"/>
-        </w:pBdr>
+        <w:spacing w:before="0" w:after="80" w:lineRule="auto" w:line="336"/>
+        <w:ind w:left="170"/>
       </w:pPr>
+      <w:r>
+        <w:rPr>
+          <w:rFonts w:ascii="等线" w:hAnsi="等线" w:eastAsia="等线"/>
+          <w:b/>
+          <w:i w:val="0"/>
+          <w:sz w:val="20"/>
+        </w:rPr>
+        <w:t>D1=A　D2=A　D3=B　D4=A　D5=A —— 五项各恰好一个选项被勾，无并列勾选、无总规则兜底。</w:t>
+      </w:r>
     </w:p>
     <w:p>
       <w:pPr>
-        <w:spacing w:before="0" w:after="120" w:lineRule="auto" w:line="336"/>
-        <w:pBdr>
-          <w:bottom w:val="single" w:sz="6" w:space="1" w:color="C9C9C9"/>
-        </w:pBdr>
+        <w:spacing w:before="0" w:after="80" w:lineRule="auto" w:line="336"/>
+        <w:ind w:left="170"/>
       </w:pPr>
+      <w:r>
+        <w:rPr>
+          <w:rFonts w:ascii="等线" w:hAnsi="等线" w:eastAsia="等线"/>
+          <w:b w:val="0"/>
+          <w:i w:val="0"/>
+          <w:sz w:val="20"/>
+        </w:rPr>
+        <w:t>对应交付 v1.1.5（Release tag v1.1.5）；对外口径全文见 docs/release-delivery-statement.md。</w:t>
+      </w:r>
     </w:p>
     <w:p>
       <w:pPr>
@@ -1905,7 +2011,7 @@
           <w:color w:val="1F3864"/>
           <w:sz w:val="32"/>
         </w:rPr>
-        <w:t>4　填完之后我会做什么</w:t>
+        <w:t>4　确认落地清单</w:t>
       </w:r>
     </w:p>
     <w:p>
@@ -1920,7 +2026,7 @@
           <w:i w:val="0"/>
           <w:sz w:val="20"/>
         </w:rPr>
-        <w:t>① 读出你的选择 → 写回 docs/PROJECT_OVERVIEW.md 与发布口径文档；</w:t>
+        <w:t>① 读出你的选择 → 写回 docs/PROJECT_OVERVIEW.md 与发布口径文档（docs/release-delivery-statement.md）；</w:t>
       </w:r>
     </w:p>
     <w:p>
@@ -1935,7 +2041,7 @@
           <w:i w:val="0"/>
           <w:sz w:val="20"/>
         </w:rPr>
-        <w:t>② D1 若改文件名 → 改 artifactName，重打安装器，并重跑「latest.yml 名字/大小/sha512 与磁盘一致」守卫；</w:t>
+        <w:t>② D1 安装包命名 → artifactName = LaomaAI-${version}-setup.${ext}，1.1.5 产物已按此发布（639,437,816 B），latest.yml 与磁盘同名同大小；</w:t>
       </w:r>
     </w:p>
     <w:p>
@@ -1950,7 +2056,7 @@
           <w:i w:val="0"/>
           <w:sz w:val="20"/>
         </w:rPr>
-        <w:t>③ D2 / D3 → 按你定的口径改 package.json 的 license 元数据、准备与安装包同版本的源码 zip、官网下载区补上源码入口；</w:t>
+        <w:t>③ D2 / D3 license 与源码交付 → package.json license=AGPL-3.0、NOTICE.txt 署名 maning636；源码走公开 GitHub 仓，官网下载区已有源码与 Releases 入口；</w:t>
       </w:r>
     </w:p>
     <w:p>
@@ -1965,7 +2071,7 @@
           <w:i w:val="0"/>
           <w:sz w:val="20"/>
         </w:rPr>
-        <w:t>④ D4 / D5 → 落到 feature gate 与下一版打包路线；</w:t>
+        <w:t>④ D4 / D5 → 已落到 feature gate（注册码 ∩ 云端订阅）与 1.1.5 单包体积；</w:t>
       </w:r>
     </w:p>
     <w:p>
@@ -1980,7 +2086,7 @@
           <w:i w:val="0"/>
           <w:sz w:val="20"/>
         </w:rPr>
-        <w:t>⑤ 全部改动跑回归（pytest / tsc / vitest / 产物守卫）后提交并推私有仓库 + 刷新备份 round17。</w:t>
+        <w:t>⑤ 全部改动跑回归（pytest / tsc / vitest / 产物守卫）后提交并推仓库 + 刷新备份 round18。</w:t>
       </w:r>
     </w:p>
     <w:sectPr>
@@ -2010,7 +2116,7 @@
         <w:color w:val="595959"/>
         <w:sz w:val="16"/>
       </w:rPr>
-      <w:t xml:space="preserve">Prism-Fusion 客户端发布形态 · 待决表　v1.0　2026-10-24　·　第 </w:t>
+      <w:t xml:space="preserve">Prism-Fusion 客户端发布形态 · 待决表（已确认）　v1.1　2026-10-24　·　第 </w:t>
     </w:r>
     <w:fldSimple w:instr=" PAGE ">
       <w:r>

</xml_diff>